<commit_message>
Refresh docs: badge 0 default, item master search, arrow keys, green pill, sticky header
Update the User Guide and Technical Reference (Word + markdown) for the
recent changes: new requisitions start with badge 0 filled in later,
badge edits commit only a number, item autofill/search reads the item
master, spreadsheet arrow-key navigation and Tab-to-pick on the entry
sheet, the green Authorized pill for any real name, and the sticky
header border fix. Doc generator now writes to RequestMaterial/docs.

Co-Authored-By: Claude Fable 5 <noreply@anthropic.com>
Claude-Session: https://claude.ai/code/session_01SfunpdkVdapnCdtb2hWS9U
</commit_message>
<xml_diff>
--- a/RequestMaterial/docs/Requisition Material - Technical Reference.docx
+++ b/RequestMaterial/docs/Requisition Material - Technical Reference.docx
@@ -58,7 +58,7 @@
         <w:t xml:space="preserve">chkAutUsr</w:t>
       </w:r>
       <w:r>
-        <w:t xml:space="preserve">, LCCONLINE level 50), preloads the four dropdown lists, and renders the page. After the page loads, every action goes through </w:t>
+        <w:t xml:space="preserve">, LCCONLINE level 50), preloads the dropdown lists, and renders the page. After the page loads, every action goes through </w:t>
       </w:r>
       <w:r>
         <w:rPr>
@@ -1370,7 +1370,7 @@
         <w:t xml:space="preserve">Station grid</w:t>
       </w:r>
       <w:r>
-        <w:t xml:space="preserve"> — two-line records like Access frmMain: fields on line 1 (Req#, Date, Requestor, Item#, Loc, Qty, Badge#, Authorized, Rush), description + the Return Item checkbox/date on line 2. Fixed pixel columns with the leftover width on Requestor; below 780px the wrap scrolls sideways instead of crushing. Stripe, hover and the ▶ selection act on the whole record (the two rows are paired by a record id). The Badge # box is a live input (change = save). Auto-refresh every 60s, plus on tab-visibility; a JSON compare skips re-renders when nothing changed.</w:t>
+        <w:t xml:space="preserve"> — two-line records like Access frmMain: fields on line 1 (Req#, Date, Requestor, Item#, Loc, Qty, Badge#, Authorized, Rush), description + the Return Item checkbox/date on line 2. Fixed pixel columns with the leftover width on Requestor; below 780px the wrap scrolls sideways instead of crushing. Stripe, hover and the ▶ selection act on the whole record (the two rows are paired by a record id). The Badge # box is a live input: a new requisition stores badge 0, and editing commits only a real number (typed name text reverts); the save updates memory and the requisition’s other lines in place, so the grid does not reload and keeps its scroll spot. The sticky header uses separate-border cells (not collapsed) so its box and column lines stay put while scrolling, which Firefox drops in collapse mode. Auto-refresh every 60s, plus on tab-visibility; a JSON compare skips re-renders when nothing changed.</w:t>
       </w:r>
     </w:p>
     <w:p>
@@ -1396,7 +1396,7 @@
         <w:t xml:space="preserve">?mode=entry</w:t>
       </w:r>
       <w:r>
-        <w:t xml:space="preserve">) — legacy getEntry.php layout: header fields, then the spreadsheet-style line sheet (the cell is the box; the focused cell gets a slim blue inner outline). Item # has autofill + a type-ahead dropdown. Enter hops fields; Enter on the last box grows the sheet.</w:t>
+        <w:t xml:space="preserve">) — legacy getEntry.php layout: header fields, then the spreadsheet-style line sheet (the cell is the box; the focused cell gets a slim blue inner outline). Item # has autofill + a type-ahead dropdown (opens on focus, filters as you type, Tab or Enter picks). Arrow keys move around the sheet like a spreadsheet (up/down rows, left/right between cells once the caret reaches the edge). Enter hops fields; Enter on the last box grows the sheet.</w:t>
       </w:r>
     </w:p>
     <w:p>
@@ -1471,7 +1471,7 @@
         <w:t xml:space="preserve">action=insert</w:t>
       </w:r>
       <w:r>
-        <w:t xml:space="preserve"> calls 001S for the header, then 002S per line; any line failure calls 009S to back the whole requisition out and returns "Line N failed ... nothing was saved."</w:t>
+        <w:t xml:space="preserve"> calls 001S for the header, then 002S per line; any line failure calls 009S to back the whole requisition out and returns "Line N failed ... nothing was saved." The header and lines store badge 0 (no longer derived from the requestor name).</w:t>
       </w:r>
     </w:p>
     <w:p>
@@ -1889,7 +1889,7 @@
         <w:spacing w:after="80"/>
       </w:pPr>
       <w:r>
-        <w:t xml:space="preserve">Badge stored properly (10 chars) and editable from the grid.</w:t>
+        <w:t xml:space="preserve">Badge no longer derived from the requestor name (substr): new requisitions store 0 and are filled in later; editable inline with an employee dropdown that commits only a number.</w:t>
       </w:r>
     </w:p>
     <w:p>
@@ -1916,6 +1916,19 @@
       </w:pPr>
       <w:r>
         <w:t xml:space="preserve">A failed submit backs out completely instead of half-saving.</w:t>
+      </w:r>
+    </w:p>
+    <w:p>
+      <w:pPr>
+        <w:pStyle w:val="ListParagraph"/>
+        <w:numPr>
+          <w:ilvl w:val="0"/>
+          <w:numId w:val="4"/>
+        </w:numPr>
+        <w:spacing w:after="80"/>
+      </w:pPr>
+      <w:r>
+        <w:t xml:space="preserve">The Authorized pill shows green for any real authorizer name (the None / In Process placeholders stay yellow), no longer gated on the inconsistent legacy authorized flag.</w:t>
       </w:r>
     </w:p>
     <w:p>

</xml_diff>

<commit_message>
Surface why the activity log file is not appearing
rqsActLog silently @-swallowed every write failure, so when the web
profile lacks write authority to the app folder the log file is never
created and there is no clue why. Keep the Clario-style file as the
primary target, but on a failed write drop the reason (error_get_last)
and the activity line to error_log (the instance php.log) so nothing is
lost and the cause is visible. Docs updated.

Co-Authored-By: Claude Fable 5 <noreply@anthropic.com>
Claude-Session: https://claude.ai/code/session_01SfunpdkVdapnCdtb2hWS9U
</commit_message>
<xml_diff>
--- a/RequestMaterial/docs/Requisition Material - Technical Reference.docx
+++ b/RequestMaterial/docs/Requisition Material - Technical Reference.docx
@@ -1586,7 +1586,22 @@
         <w:spacing w:after="120"/>
       </w:pPr>
       <w:r>
-        <w:t xml:space="preserve">Write failures are @-suppressed - logging can never take the app down. The file is created on first write (web profile needs write authority to the folder) and grows forever; trim it yearly. Replaced the RQSACTLOGT Db2 table, which nothing read.</w:t>
+        <w:t xml:space="preserve">The file is created on first write, so the </w:t>
+      </w:r>
+      <w:r>
+        <w:rPr>
+          <w:shd w:fill="FFF35C" w:val="clear"/>
+        </w:rPr>
+        <w:t xml:space="preserve">web profile needs write authority to the app folder</w:t>
+      </w:r>
+      <w:r>
+        <w:t xml:space="preserve"> - the usual reason no log appears. The write is still suppressed so a bad write never takes the app down, but on failure the reason and the line drop to </w:t>
+      </w:r>
+      <w:r>
+        <w:t xml:space="preserve">error_log</w:t>
+      </w:r>
+      <w:r>
+        <w:t xml:space="preserve"> (the instance php.log) instead of vanishing, so nothing is lost and you can see why. The file grows forever; trim it yearly. Replaced the RQSACTLOGT Db2 table, which nothing read.</w:t>
       </w:r>
     </w:p>
     <w:p>

</xml_diff>

<commit_message>
Docs: Returned column on both reports, monthly opens on current month
Update the User Guide and Technical Reference (Word + markdown) for the
report changes: the Returned column (green return date or a dash), the
Preview report now listing every line, the Monthly report opening on the
current month, and REQSTN008S returning RDRTNF/RDRTDT.

Co-Authored-By: Claude Fable 5 <noreply@anthropic.com>
Claude-Session: https://claude.ai/code/session_01SfunpdkVdapnCdtb2hWS9U
</commit_message>
<xml_diff>
--- a/RequestMaterial/docs/Requisition Material - Technical Reference.docx
+++ b/RequestMaterial/docs/Requisition Material - Technical Reference.docx
@@ -1178,7 +1178,7 @@
               <w:spacing w:after="0"/>
             </w:pPr>
             <w:r>
-              <w:t xml:space="preserve">IN yyyymm; returns header + lines with RDEXTC/RDEXTR computed, ordered name/date/req/line.</w:t>
+              <w:t xml:space="preserve">IN yyyymm; returns header + lines with RDEXTC/RDEXTR computed plus RDRTNF/RDRTDT for the Returned column, ordered name/date/req/line.</w:t>
             </w:r>
           </w:p>
         </w:tc>
@@ -1361,7 +1361,7 @@
         <w:t xml:space="preserve">input type=month</w:t>
       </w:r>
       <w:r>
-        <w:t xml:space="preserve">, which Firefox renders as a dead text box), Preview Report. Print windows print THEMSELVES on load and close on afterprint - if the station called print(), the station’s own thread sat blocked in the dialog and the whole app froze.</w:t>
+        <w:t xml:space="preserve">, which Firefox renders as a dead text box; opens on the current month automatically) and Preview Report. Both add a Returned column (green return date, or a dash while still out); the Preview lists every line now, not just unreturned, and the Monthly totals are compact single ruled lines so a busy month stays to few pages. Print windows print THEMSELVES on load and close on afterprint - if the station called print(), the station’s own thread sat blocked in the dialog and the whole app froze.</w:t>
       </w:r>
     </w:p>
     <w:p>

</xml_diff>

<commit_message>
Rewrite the User Guide and Technical Reference
Keep both documents to the objects this RFP actually ships. Drop every
mention of source control, of how the sources were recovered, and of
other tools built here, so the documents stand on their own.

User Guide: plainer language throughout, the internal detail removed,
and bold, underline and highlight used to mark the things people need to
notice. Corrected the print description now that the report prints from
the page itself with no second window.

Technical Reference: tightened, the dev only loader dropped since it is
not an RFP object, and the report, print and activity log sections
brought in line with how the screen behaves today.

Co-Authored-By: Claude Fable 5 <noreply@anthropic.com>
Claude-Session: https://claude.ai/code/session_01SfunpdkVdapnCdtb2hWS9U
</commit_message>
<xml_diff>
--- a/RequestMaterial/docs/Requisition Material - Technical Reference.docx
+++ b/RequestMaterial/docs/Requisition Material - Technical Reference.docx
@@ -36,25 +36,25 @@
         <w:spacing w:after="120"/>
       </w:pPr>
       <w:r>
-        <w:t xml:space="preserve">Requisition Material is a web screen on the IBM i, built on the LCCOnline framework like the other LCC tools (same pattern as the Sellbrite Bulk Loader). The entry point is </w:t>
+        <w:t xml:space="preserve">Requisition Material is a web screen on the IBM i, built on the LCCOnline framework. The entry point is </w:t>
       </w:r>
       <w:r>
         <w:t xml:space="preserve">Requisitions_ctl.php</w:t>
       </w:r>
       <w:r>
-        <w:t xml:space="preserve">. It runs the framework session scripts (StartBlockScriptA/B), checks authority (</w:t>
+        <w:t xml:space="preserve">: it runs the framework session scripts (StartBlockScriptA and StartBlockScriptB), checks authority with </w:t>
       </w:r>
       <w:r>
         <w:t xml:space="preserve">chkAutUsr</w:t>
       </w:r>
       <w:r>
-        <w:t xml:space="preserve">, LCCONLINE level 50), preloads the dropdown lists, and renders the page. After the page loads, every action goes through </w:t>
+        <w:t xml:space="preserve"> at LCCONLINE level 50, preloads the dropdown lists, and renders the page. Every action after that goes through </w:t>
       </w:r>
       <w:r>
         <w:t xml:space="preserve">Requisitions_ajax.php</w:t>
       </w:r>
       <w:r>
-        <w:t xml:space="preserve"> as an AJAX request that returns JSON. There are no page reloads.</w:t>
+        <w:t xml:space="preserve"> as an AJAX request returning JSON, so there are no page reloads.</w:t>
       </w:r>
     </w:p>
     <w:p>
@@ -65,7 +65,7 @@
         <w:t xml:space="preserve">?mode=entry</w:t>
       </w:r>
       <w:r>
-        <w:t xml:space="preserve"> renders the same page in entry-only mode: the add form IS the page, the grid and reports never render, and a fresh blank form follows every submit. That link is the workfloor shortcut; the plain URL is the full station.</w:t>
+        <w:t xml:space="preserve"> renders the same page in entry only mode: the add form is the page, the grid and reports never render, and a fresh blank form follows every submit. That link is the workfloor shortcut and the plain URL is the full station.</w:t>
       </w:r>
     </w:p>
     <w:p>
@@ -73,7 +73,7 @@
         <w:pStyle w:val="Heading2"/>
       </w:pPr>
       <w:r>
-        <w:t xml:space="preserve">File map</w:t>
+        <w:t xml:space="preserve">The four PHP files</w:t>
       </w:r>
     </w:p>
     <w:tbl>
@@ -182,7 +182,7 @@
               <w:spacing w:after="0"/>
             </w:pPr>
             <w:r>
-              <w:t xml:space="preserve">Controller. Session sign-on, authority check, dropdown preload, renders the display.</w:t>
+              <w:t xml:space="preserve">Controller. Session sign on, authority check, dropdown preload, renders the display.</w:t>
             </w:r>
           </w:p>
         </w:tc>
@@ -222,7 +222,7 @@
               <w:spacing w:after="0"/>
             </w:pPr>
             <w:r>
-              <w:t xml:space="preserve">Display. CSS, all HTML (grid + modals) and all JavaScript, inline in the one file.</w:t>
+              <w:t xml:space="preserve">Display. The CSS, all HTML (grid and modals) and all JavaScript, inline in the one file.</w:t>
             </w:r>
           </w:p>
         </w:tc>
@@ -262,7 +262,7 @@
               <w:spacing w:after="0"/>
             </w:pPr>
             <w:r>
-              <w:t xml:space="preserve">AJAX router. JSON for everything; validates, back-outs, writes the activity log.</w:t>
+              <w:t xml:space="preserve">AJAX router. JSON for everything: validates, backs out a failed insert, writes the activity log.</w:t>
             </w:r>
           </w:p>
         </w:tc>
@@ -302,47 +302,13 @@
               <w:spacing w:after="0"/>
             </w:pPr>
             <w:r>
-              <w:t xml:space="preserve">Db2 access. rqs* functions, CALL REQSTNnnnS only - no inline SQL anywhere.</w:t>
-            </w:r>
-          </w:p>
-        </w:tc>
-      </w:tr>
-      <w:tr>
-        <w:tc>
-          <w:tcPr>
-            <w:tcW w:type="dxa" w:w="3100"/>
-            <w:tcMar>
-              <w:top w:type="dxa" w:w="60"/>
-              <w:left w:type="dxa" w:w="100"/>
-              <w:bottom w:type="dxa" w:w="60"/>
-              <w:right w:type="dxa" w:w="100"/>
-            </w:tcMar>
-          </w:tcPr>
-          <w:p>
-            <w:pPr>
-              <w:spacing w:after="0"/>
-            </w:pPr>
-            <w:r>
-              <w:t xml:space="preserve">Requisitions_seed.php</w:t>
-            </w:r>
-          </w:p>
-        </w:tc>
-        <w:tc>
-          <w:tcPr>
-            <w:tcW w:type="dxa" w:w="6260"/>
-            <w:tcMar>
-              <w:top w:type="dxa" w:w="60"/>
-              <w:left w:type="dxa" w:w="100"/>
-              <w:bottom w:type="dxa" w:w="60"/>
-              <w:right w:type="dxa" w:w="100"/>
-            </w:tcMar>
-          </w:tcPr>
-          <w:p>
-            <w:pPr>
-              <w:spacing w:after="0"/>
-            </w:pPr>
-            <w:r>
-              <w:t xml:space="preserve">Dev-only browser loader for the CSV history files. Not an RFP object; remove from the server after the load.</w:t>
+              <w:t xml:space="preserve">Db2 access. The rqs functions call </w:t>
+            </w:r>
+            <w:r>
+              <w:t xml:space="preserve">REQSTNnnnS</w:t>
+            </w:r>
+            <w:r>
+              <w:t xml:space="preserve"> procedures only, with no inline SQL anywhere.</w:t>
             </w:r>
           </w:p>
         </w:tc>
@@ -358,7 +324,7 @@
         <w:pStyle w:val="Heading1"/>
       </w:pPr>
       <w:r>
-        <w:t xml:space="preserve">2. Databases (library currently LSCDEVLIBP)</w:t>
+        <w:t xml:space="preserve">2. Tables (library currently LSCDEVLIBP)</w:t>
       </w:r>
     </w:p>
     <w:tbl>
@@ -467,7 +433,7 @@
               <w:spacing w:after="0"/>
             </w:pPr>
             <w:r>
-              <w:t xml:space="preserve">One row per requisition. RHREQ# is a GENERATED identity (restarted at 17179 after the history load). Name, DEC(8,0)/DEC(6,0) date+time, area code/type, rush flag, authorized flag + by, badge, comments.</w:t>
+              <w:t xml:space="preserve">One row per requisition. RHREQ# is a GENERATED identity, restarted at 17179 after the history load. Name, date and time, area code and type, rush flag, authorized flag and name, badge, comments.</w:t>
             </w:r>
           </w:p>
         </w:tc>
@@ -507,7 +473,7 @@
               <w:spacing w:after="0"/>
             </w:pPr>
             <w:r>
-              <w:t xml:space="preserve">One row per line. PK (RDREQ#, RDLIN#). Item, loc, coin date, description, qty, cost/retail DEC(13,4), add cost, badge, SKU-to, RDRTNF returned flag + RDRTDT date returned.</w:t>
+              <w:t xml:space="preserve">One row per line, keyed by RDREQ# and RDLIN#. Item, location, coin date, description, qty, cost and retail as DEC(13,4), add cost, badge, SKU to, plus RDRTNF returned flag and RDRTDT date returned.</w:t>
             </w:r>
           </w:p>
         </w:tc>
@@ -547,7 +513,7 @@
               <w:spacing w:after="0"/>
             </w:pPr>
             <w:r>
-              <w:t xml:space="preserve">The code file: the four seeded dropdown lists in one table, keyed by CDTYPE + CDCODE - AREACODE (3), AREATYPE (16), NAMES (65), AUTHBY (6). The BADGE list is not stored here: it reads live from LSCPRDLIB/XEMPLOYP. "Authorization = None" is a REAL AUTHBY row (13k+ historical headers store that literal), sorts first, and is the natural default - nothing synthetic in the code.</w:t>
+              <w:t xml:space="preserve">The code file: four dropdown lists in one table keyed by CDTYPE and CDCODE, holding AREACODE (3), AREATYPE (16), NAMES (65) and AUTHBY (6). The badge list is not stored here, it reads live from LSCPRDLIB/XEMPLOYP. "Authorization = None" is a real AUTHBY row that over 13,000 historical headers store, it sorts first, and it is the natural default.</w:t>
             </w:r>
           </w:p>
         </w:tc>
@@ -563,7 +529,7 @@
         <w:spacing w:after="120"/>
       </w:pPr>
       <w:r>
-        <w:t xml:space="preserve">All three are journaled to LSCSAVLIB/LSCJRN. Dates follow the shop convention: DEC(8,0) yyyymmdd + DEC(6,0) hhmmss, not date types.</w:t>
+        <w:t xml:space="preserve">All three are journaled to LSCSAVLIB/LSCJRN. Dates follow the shop convention of DEC(8,0) yyyymmdd plus DEC(6,0) hhmmss rather than date types.</w:t>
       </w:r>
     </w:p>
     <w:p>
@@ -571,19 +537,7 @@
         <w:spacing w:after="120"/>
       </w:pPr>
       <w:r>
-        <w:t xml:space="preserve">Legacy data notes: Access booleans (-1/0) became Y/N; the </w:t>
-      </w:r>
-      <w:r>
-        <w:t xml:space="preserve">authorized</w:t>
-      </w:r>
-      <w:r>
-        <w:t xml:space="preserve"> flag is derived from the authorized-by text; historical badges are a mix of real numbers and the old PHP’s </w:t>
-      </w:r>
-      <w:r>
-        <w:t xml:space="preserve">substr(name, 0, 4)</w:t>
-      </w:r>
-      <w:r>
-        <w:t xml:space="preserve"> habit.</w:t>
+        <w:t xml:space="preserve">Data notes from the load: the old boolean values became Y and N, the authorized flag is derived from the authorized by text, and historical badges are a mix of real numbers and a truncated name from the old screen.</w:t>
       </w:r>
     </w:p>
     <w:p>
@@ -599,13 +553,13 @@
         <w:spacing w:after="120"/>
       </w:pPr>
       <w:r>
-        <w:t xml:space="preserve">All are </w:t>
+        <w:t xml:space="preserve">All nine are </w:t>
       </w:r>
       <w:r>
         <w:t xml:space="preserve">CREATE OR REPLACE</w:t>
       </w:r>
       <w:r>
-        <w:t xml:space="preserve">, </w:t>
+        <w:t xml:space="preserve"> with </w:t>
       </w:r>
       <w:r>
         <w:t xml:space="preserve">SET OPTION DBGVIEW = *SOURCE, DYNUSRPRF = *OWNER</w:t>
@@ -765,7 +719,7 @@
               <w:spacing w:after="0"/>
             </w:pPr>
             <w:r>
-              <w:t xml:space="preserve">OUT new req# via IDENTITY_VAL_LOCAL(). Kills the legacy max(req_num)+1 race.</w:t>
+              <w:t xml:space="preserve">Returns the new req number through IDENTITY_VAL_LOCAL(), which removes the old max plus one race.</w:t>
             </w:r>
           </w:p>
         </w:tc>
@@ -824,7 +778,7 @@
               <w:spacing w:after="0"/>
             </w:pPr>
             <w:r>
-              <w:t xml:space="preserve">12 IN parameters.</w:t>
+              <w:t xml:space="preserve">Twelve IN parameters.</w:t>
             </w:r>
           </w:p>
         </w:tc>
@@ -883,7 +837,7 @@
               <w:spacing w:after="0"/>
             </w:pPr>
             <w:r>
-              <w:t xml:space="preserve">IN INSHOW CHAR(1): O open (RDRTNF=’N’, the default), R returned (RDRTNF=’Y’), A all. IN INSRCH VARCHAR(50) filters req#/name/item/badge (blank = all). Header JOIN detail, returned ordered by return date; ROW_NUMBER caps Returned/All to the 500 most recent so the 50k history never renders at once.</w:t>
+              <w:t xml:space="preserve">INSHOW CHAR(1) picks O for open (the default), R for returned, A for all. INSRCH VARCHAR(50) filters req number, name, item or badge, and blank returns everything. ROW_NUMBER caps returned lines to the 500 most recent so the full history never renders at once.</w:t>
             </w:r>
           </w:p>
         </w:tc>
@@ -942,7 +896,7 @@
               <w:spacing w:after="0"/>
             </w:pPr>
             <w:r>
-              <w:t xml:space="preserve">Header LEFT JOIN all lines, ordered by line.</w:t>
+              <w:t xml:space="preserve">Header LEFT JOIN all of its lines, ordered by line number.</w:t>
             </w:r>
           </w:p>
         </w:tc>
@@ -1001,7 +955,7 @@
               <w:spacing w:after="0"/>
             </w:pPr>
             <w:r>
-              <w:t xml:space="preserve">Authorized-by, comments, badge - NULL leaves a column unchanged (COALESCE), so the view window and the grid’s badge box share one proc. RHAUTF derives from the authorized-by value.</w:t>
+              <w:t xml:space="preserve">Authorized by, comments and badge, where a NULL argument leaves that column unchanged, so the view window and the grid badge box share one procedure. RHAUTF is derived from the authorized by value.</w:t>
             </w:r>
           </w:p>
         </w:tc>
@@ -1041,7 +995,7 @@
               <w:spacing w:after="0"/>
             </w:pPr>
             <w:r>
-              <w:t xml:space="preserve">Mark/unmark returned</w:t>
+              <w:t xml:space="preserve">Mark or unmark returned</w:t>
             </w:r>
           </w:p>
         </w:tc>
@@ -1060,7 +1014,7 @@
               <w:spacing w:after="0"/>
             </w:pPr>
             <w:r>
-              <w:t xml:space="preserve">Idempotent (flag guard). INRTDT = caller-entered return date; 0 stamps today.</w:t>
+              <w:t xml:space="preserve">Idempotent through a flag guard. INRTDT carries the entered return date and 0 stamps today.</w:t>
             </w:r>
           </w:p>
         </w:tc>
@@ -1119,7 +1073,7 @@
               <w:spacing w:after="0"/>
             </w:pPr>
             <w:r>
-              <w:t xml:space="preserve">INTYPE picks the cursor: any code list from RQSCODEFLT; BADGE = live active employees (LEESTAT A) from LSCPRDLIB/XEMPLOYP; ITEM = autofill from the LSCPRDLIB/ITMMSTP item master (description, coin year) + last-used cost/retail from history, with history fallback for legacy items; ITEMSRCH = the item list from LSCPRDLIB/ITMMSTP (first 200 per prefix), history-enriched.</w:t>
+              <w:t xml:space="preserve">INTYPE picks the cursor: any code list from RQSCODEFLT, BADGE for live active employees from LSCPRDLIB/XEMPLOYP, ITEM for autofill from the LSCPRDLIB/ITMMSTP item master with last used cost and retail from history, and ITEMSRCH for the searchable item list, first 200 per prefix.</w:t>
             </w:r>
           </w:p>
         </w:tc>
@@ -1178,7 +1132,7 @@
               <w:spacing w:after="0"/>
             </w:pPr>
             <w:r>
-              <w:t xml:space="preserve">IN yyyymm; returns header + lines with RDEXTC/RDEXTR computed plus RDRTNF/RDRTDT for the Returned column, ordered name/date/req/line.</w:t>
+              <w:t xml:space="preserve">Takes yyyymm and returns header and lines with extended cost and retail computed, plus RDRTNF and RDRTDT for the Returned column, ordered by name, date, req and line.</w:t>
             </w:r>
           </w:p>
         </w:tc>
@@ -1237,7 +1191,7 @@
               <w:spacing w:after="0"/>
             </w:pPr>
             <w:r>
-              <w:t xml:space="preserve">Detail then header. The web insert’s back-out - a failed submit never leaves half a requisition.</w:t>
+              <w:t xml:space="preserve">Detail then header. This is the insert back out, so a failed submit never leaves half a requisition.</w:t>
             </w:r>
           </w:p>
         </w:tc>
@@ -1275,13 +1229,13 @@
         <w:t xml:space="preserve">does NOT replace across different parameter counts</w:t>
       </w:r>
       <w:r>
-        <w:t xml:space="preserve"> - changing a proc’s signature creates a second overload and the old one lingers until dropped (</w:t>
-      </w:r>
-      <w:r>
-        <w:t xml:space="preserve">DROP PROCEDURE name(type, ...)</w:t>
-      </w:r>
-      <w:r>
-        <w:t xml:space="preserve">). The RFP checklist tracks the drops done during development.</w:t>
+        <w:t xml:space="preserve">. Changing a signature creates a second overload and the old one lingers until it is dropped with </w:t>
+      </w:r>
+      <w:r>
+        <w:t xml:space="preserve">DROP PROCEDURE name(type, type)</w:t>
+      </w:r>
+      <w:r>
+        <w:t xml:space="preserve">. The RFP checklist tracks the drops done during development.</w:t>
       </w:r>
     </w:p>
     <w:p>
@@ -1289,7 +1243,7 @@
         <w:pStyle w:val="Heading1"/>
       </w:pPr>
       <w:r>
-        <w:t xml:space="preserve">4. Views</w:t>
+        <w:t xml:space="preserve">4. Screens</w:t>
       </w:r>
     </w:p>
     <w:p>
@@ -1301,10 +1255,10 @@
           <w:b/>
           <w:bCs/>
         </w:rPr>
-        <w:t xml:space="preserve">Station grid</w:t>
-      </w:r>
-      <w:r>
-        <w:t xml:space="preserve"> - two-line records like Access frmMain: fields on line 1 (Req#, Date, Requestor, Item#, Loc, Qty, Badge#, Authorized, Rush), description + the Return Item checkbox/date on line 2. Fixed pixel columns with the leftover width on Requestor; below 780px the wrap scrolls sideways instead of crushing. Stripe, hover and the ▶ selection act on the whole record (the two rows are paired by a record id). The Badge # box is a live input: a new requisition stores badge 0, and editing commits only a real number (typed name text reverts); the save updates memory and the requisition’s other lines in place, so the grid does not reload and keeps its scroll spot. The Show dropdown (Open / Returned / All) re-queries 003S with the INSHOW code; returned lines render their return date read-only in place of the Return Item box. Returned/All are capped server-side to the 500 most recent, and the Filter box drives an INSRCH server search over the whole history for those modes (debounced) while Open filters its loaded rows in the browser. Every column header sorts client-side (click to toggle asc/desc, arrow shown). The sticky header uses separate-border cells plus an inset box-shadow on the bottom edge so its black box and column lines stay put while scrolling, which browsers otherwise drop on a sticky cell. Auto-refresh every 60s, plus on tab-visibility; a JSON compare skips re-renders when nothing changed.</w:t>
+        <w:t xml:space="preserve">Station grid.</w:t>
+      </w:r>
+      <w:r>
+        <w:t xml:space="preserve"> Two line records: the fields on line one (Req number, Date, Requestor, Item number, Loc, Qty, Badge number, Authorized, Rush) and the description plus the Return Item box on line two. Columns are fixed pixels with the leftover width on Requestor, and below 780px the wrapper scrolls sideways instead of crushing. Stripe, hover and selection act on the whole record because the two rows are paired by a record id. The Badge box saves on change. The Show dropdown requeries REQSTN003S with the INSHOW code, and returned lines show their return date read only in place of the Return Item box. Returned and All are capped to the 500 most recent on the server, and for those modes the Filter box drives an INSRCH search over the whole history while Open filters its loaded rows in the browser. Every column header sorts in the browser. The sticky header draws its box and column lines with box shadow so they stay put while scrolling. Auto refresh runs every 60 seconds and on tab visibility, and a JSON compare skips the redraw when nothing changed.</w:t>
       </w:r>
     </w:p>
     <w:p>
@@ -1319,13 +1273,13 @@
         <w:t xml:space="preserve">Entry form</w:t>
       </w:r>
       <w:r>
-        <w:t xml:space="preserve"> (modal on the station, full page in </w:t>
+        <w:t xml:space="preserve"> (a modal on the station, the whole page under </w:t>
       </w:r>
       <w:r>
         <w:t xml:space="preserve">?mode=entry</w:t>
       </w:r>
       <w:r>
-        <w:t xml:space="preserve">) - legacy getEntry.php layout: header fields, then the spreadsheet-style line sheet (the cell is the box; the focused cell gets a slim blue inner outline). Item # has autofill + a type-ahead dropdown (opens on focus, filters as you type, Tab or Enter picks). Arrow keys move around the sheet like a spreadsheet (up/down rows, left/right between cells once the caret reaches the edge). Enter hops fields; Enter on the last box grows the sheet.</w:t>
+        <w:t xml:space="preserve">). Header fields, then the spreadsheet style line sheet where the cell is the box and the focused cell gets a slim blue inner outline. Item number has autofill and a typeahead dropdown that opens on focus, filters as you type, and takes Tab or Enter to pick. Arrow keys move around the sheet, Enter hops fields, and Enter on the last box grows the sheet.</w:t>
       </w:r>
     </w:p>
     <w:p>
@@ -1337,10 +1291,10 @@
           <w:b/>
           <w:bCs/>
         </w:rPr>
-        <w:t xml:space="preserve">View window</w:t>
-      </w:r>
-      <w:r>
-        <w:t xml:space="preserve"> - legacy request.php layout; Update posts authorized-by + comments; per-line Returned checkboxes post immediately and un-return here too; a Date Ret. column shows when each returned line came back; Print.</w:t>
+        <w:t xml:space="preserve">View window.</w:t>
+      </w:r>
+      <w:r>
+        <w:t xml:space="preserve"> Update posts the authorized by name and comments, per line Returned boxes post immediately and un return here as well, a Date Ret. column shows when each returned line came back, and Print gives the paper copy.</w:t>
       </w:r>
     </w:p>
     <w:p>
@@ -1352,16 +1306,28 @@
           <w:b/>
           <w:bCs/>
         </w:rPr>
-        <w:t xml:space="preserve">Report modals/windows</w:t>
-      </w:r>
-      <w:r>
-        <w:t xml:space="preserve"> - Monthly Update (month/year dropdowns - not </w:t>
+        <w:t xml:space="preserve">Reports.</w:t>
+      </w:r>
+      <w:r>
+        <w:t xml:space="preserve"> Monthly Update uses month and year dropdowns rather than </w:t>
       </w:r>
       <w:r>
         <w:t xml:space="preserve">input type=month</w:t>
       </w:r>
       <w:r>
-        <w:t xml:space="preserve">, which Firefox renders as a dead text box; opens on the current month automatically) and Preview Report. Both add a Returned column (green return date, or a dash while still out); the Preview lists every line now, not just unreturned, and the Monthly totals are compact single ruled lines so a busy month stays to few pages. The report renders into a hidden zero size iframe on the current page and prints that, so no separate window opens, with print-color-adjust exact so the band and totals backgrounds render on paper. The on screen modal is id scoped (#rptBody) so the framework page global table gridlines do not leak into it and the preview matches the printout. Printing always brings up the browser modal print dialog, which briefly locks the browser until the user prints or cancels (unavoidable from a web page); the iframe carries the print call so the station own JS thread is never the one blocked.</w:t>
+        <w:t xml:space="preserve">, which Firefox renders as a dead text box, and it opens on the current month with no Run button. Both reports carry a Returned column showing a green return date or a dash while the item is still out, the preview lists every line, and the monthly totals are compact single ruled lines so a busy month stays to few pages. The report renders into a hidden zero size iframe on the current page and prints that, so no separate window opens, and </w:t>
+      </w:r>
+      <w:r>
+        <w:t xml:space="preserve">print-color-adjust: exact</w:t>
+      </w:r>
+      <w:r>
+        <w:t xml:space="preserve"> keeps the band and totals backgrounds on paper. The on screen modal is id scoped to </w:t>
+      </w:r>
+      <w:r>
+        <w:t xml:space="preserve">#rptBody</w:t>
+      </w:r>
+      <w:r>
+        <w:t xml:space="preserve"> so the framework page global table gridlines do not leak in and the preview matches the printout. Printing always brings up the browser print dialog, which briefly holds the browser until the user prints or cancels and cannot be avoided from a web page.</w:t>
       </w:r>
     </w:p>
     <w:p>
@@ -1381,16 +1347,10 @@
           <w:b/>
           <w:bCs/>
         </w:rPr>
-        <w:t xml:space="preserve">Insert</w:t>
-      </w:r>
-      <w:r>
-        <w:t xml:space="preserve"> - the browser serializes the form to one JSON payload; </w:t>
-      </w:r>
-      <w:r>
-        <w:t xml:space="preserve">action=insert</w:t>
-      </w:r>
-      <w:r>
-        <w:t xml:space="preserve"> calls 001S for the header, then 002S per line; any line failure calls 009S to back the whole requisition out and returns "Line N failed ... nothing was saved." The header and lines store badge 0 (no longer derived from the requestor name).</w:t>
+        <w:t xml:space="preserve">Insert.</w:t>
+      </w:r>
+      <w:r>
+        <w:t xml:space="preserve"> The browser serializes the form into one JSON payload. The insert action calls REQSTN001S for the header then REQSTN002S per line, and any line failure calls REQSTN009S to back the whole requisition out and returns a message naming the line that failed.</w:t>
       </w:r>
     </w:p>
     <w:p>
@@ -1402,16 +1362,16 @@
           <w:b/>
           <w:bCs/>
         </w:rPr>
-        <w:t xml:space="preserve">Grid refresh</w:t>
-      </w:r>
-      <w:r>
-        <w:t xml:space="preserve"> - </w:t>
+        <w:t xml:space="preserve">Grid refresh.</w:t>
+      </w:r>
+      <w:r>
+        <w:t xml:space="preserve"> </w:t>
       </w:r>
       <w:r>
         <w:t xml:space="preserve">loadGrid()</w:t>
       </w:r>
       <w:r>
-        <w:t xml:space="preserve"> first submits every pending Return Item (006S per line, with the entered date), then pulls 003S with the current Show code and (for Returned/All) the Filter text as the search. Checking Return Item only queues the return client-side (a map keyed req|line that survives re-renders); the refresh is what commits it - the Access requery behavior. A pending return with an invalid date holds the refresh instead of silently losing it.</w:t>
+        <w:t xml:space="preserve"> first submits every pending Return Item through REQSTN006S with the entered date, then pulls REQSTN003S with the current Show code and, for Returned and All, the Filter text as the search. Ticking Return Item only queues the return in the browser in a map keyed by req and line that survives redraws, and the refresh is what commits it. A pending return with an invalid date holds the refresh rather than silently losing it.</w:t>
       </w:r>
     </w:p>
     <w:p>
@@ -1423,10 +1383,10 @@
           <w:b/>
           <w:bCs/>
         </w:rPr>
-        <w:t xml:space="preserve">Update</w:t>
-      </w:r>
-      <w:r>
-        <w:t xml:space="preserve"> - the view window sends authBy + comments, the badge box sends badge only; missing fields ride as NULL and 005S leaves those columns alone.</w:t>
+        <w:t xml:space="preserve">Update.</w:t>
+      </w:r>
+      <w:r>
+        <w:t xml:space="preserve"> The view window sends the authorized by name and comments, the badge box sends only the badge, and the missing fields ride as NULL so REQSTN005S leaves those columns alone.</w:t>
       </w:r>
     </w:p>
     <w:p>
@@ -1438,16 +1398,10 @@
           <w:b/>
           <w:bCs/>
         </w:rPr>
-        <w:t xml:space="preserve">Lookups</w:t>
-      </w:r>
-      <w:r>
-        <w:t xml:space="preserve"> - preloaded with the page by the ctl (saves a round trip); the ajax </w:t>
-      </w:r>
-      <w:r>
-        <w:t xml:space="preserve">lookups</w:t>
-      </w:r>
-      <w:r>
-        <w:t xml:space="preserve"> action is the fallback if the preload failed.</w:t>
+        <w:t xml:space="preserve">Lookups.</w:t>
+      </w:r>
+      <w:r>
+        <w:t xml:space="preserve"> The controller preloads the lists with the page to save a round trip, and the ajax lookups action is the fallback if that preload failed.</w:t>
       </w:r>
     </w:p>
     <w:p>
@@ -1459,22 +1413,22 @@
           <w:b/>
           <w:bCs/>
         </w:rPr>
-        <w:t xml:space="preserve">Item autofill / search</w:t>
-      </w:r>
-      <w:r>
-        <w:t xml:space="preserve"> - </w:t>
+        <w:t xml:space="preserve">Item autofill and search.</w:t>
+      </w:r>
+      <w:r>
+        <w:t xml:space="preserve"> </w:t>
       </w:r>
       <w:r>
         <w:t xml:space="preserve">itemlookup</w:t>
       </w:r>
       <w:r>
-        <w:t xml:space="preserve"> (exact, on change) and </w:t>
+        <w:t xml:space="preserve"> runs on an exact item number and </w:t>
       </w:r>
       <w:r>
         <w:t xml:space="preserve">itemsearch</w:t>
       </w:r>
       <w:r>
-        <w:t xml:space="preserve"> (opens on focus with the full list, 250ms debounce while typing, 200 rows per view) both ride REQSTN007S.</w:t>
+        <w:t xml:space="preserve"> opens on focus with the full list, debounced 250ms while typing and 200 rows per view. Both ride REQSTN007S.</w:t>
       </w:r>
     </w:p>
     <w:p>
@@ -1501,19 +1455,19 @@
         <w:t xml:space="preserve">die()</w:t>
       </w:r>
       <w:r>
-        <w:t xml:space="preserve"> anywhere near JSON. Model functions return false and stash the real Db2 message (</w:t>
+        <w:t xml:space="preserve"> anywhere near JSON. Model functions return false and stash the real Db2 message from </w:t>
       </w:r>
       <w:r>
         <w:t xml:space="preserve">db2_stmt_errormsg</w:t>
       </w:r>
       <w:r>
-        <w:t xml:space="preserve">) in </w:t>
+        <w:t xml:space="preserve"> in </w:t>
       </w:r>
       <w:r>
         <w:t xml:space="preserve">$GLOBALS[’rqsErr’]</w:t>
       </w:r>
       <w:r>
-        <w:t xml:space="preserve"> and the PHP error log; the ajax layer returns </w:t>
+        <w:t xml:space="preserve"> and the PHP error log, then the ajax layer returns </w:t>
       </w:r>
       <w:r>
         <w:t xml:space="preserve">{ok:false, msg}</w:t>
@@ -1532,7 +1486,7 @@
         <w:spacing w:after="80"/>
       </w:pPr>
       <w:r>
-        <w:t xml:space="preserve">The ajax endpoint buffers output from byte 0 and clears it before the JSON - a stray include warning can’t corrupt a response.</w:t>
+        <w:t xml:space="preserve">The ajax endpoint buffers output from byte 0 and clears it before the JSON, so a stray include warning cannot corrupt a response.</w:t>
       </w:r>
     </w:p>
     <w:p>
@@ -1545,7 +1499,7 @@
         <w:spacing w:after="80"/>
       </w:pPr>
       <w:r>
-        <w:t xml:space="preserve">Background work (auto-refresh, autofill) never pops dialogs; failures turn the Updated stamp red instead. Foreground actions get the real message in a dialog.</w:t>
+        <w:t xml:space="preserve">Background work such as auto refresh and autofill never pops dialogs, it turns the Updated stamp red instead. Foreground actions get the real message in a dialog.</w:t>
       </w:r>
     </w:p>
     <w:p>
@@ -1564,19 +1518,13 @@
         <w:t xml:space="preserve">requisition_activity.log</w:t>
       </w:r>
       <w:r>
-        <w:t xml:space="preserve"> in the </w:t>
+        <w:t xml:space="preserve"> is written to the </w:t>
       </w:r>
       <w:r>
         <w:t xml:space="preserve">LCCOnline_logs</w:t>
       </w:r>
       <w:r>
-        <w:t xml:space="preserve"> folder beside the PHP - same </w:t>
-      </w:r>
-      <w:r>
-        <w:t xml:space="preserve">@file_put_contents(..., FILE_APPEND)</w:t>
-      </w:r>
-      <w:r>
-        <w:t xml:space="preserve"> pattern as ClarioSFTP_pull.log. One line per event: timestamp, user profile, station IP, action, detail.</w:t>
+        <w:t xml:space="preserve"> folder beside the PHP, one appended line per event holding the timestamp, user profile, station IP, action and detail.</w:t>
       </w:r>
     </w:p>
     <w:p>
@@ -1584,7 +1532,7 @@
         <w:spacing w:after="120"/>
       </w:pPr>
       <w:r>
-        <w:t xml:space="preserve">Events: OPEN (page load, station vs entry form), INSERT (req + line count), UPDATE (req, badge when changed from the grid), RETURN/UNRETURN (req + line + entered date), BACKOUT (failed insert rolled back).</w:t>
+        <w:t xml:space="preserve">Events are OPEN (page load, station or entry form), INSERT (req and line count), UPDATE (req, and the badge when changed from the grid), RETURN and UNRETURN (req, line and entered date), and BACKOUT (a failed insert rolled back).</w:t>
       </w:r>
     </w:p>
     <w:p>
@@ -1604,16 +1552,16 @@
         <w:rPr>
           <w:shd w:fill="FFF35C" w:val="clear"/>
         </w:rPr>
-        <w:t xml:space="preserve">the web profile is not granted write to the docroot but is to LCCOnline_logs</w:t>
-      </w:r>
-      <w:r>
-        <w:t xml:space="preserve"> (where the framework and Sellbrite logs already land) - point it at the docroot and no file ever appears. The write is still suppressed so a bad write never takes the app down, but on failure the reason and the line drop to </w:t>
+        <w:t xml:space="preserve">the web profile is not granted write to the docroot but is granted it there</w:t>
+      </w:r>
+      <w:r>
+        <w:t xml:space="preserve">, so pointing it at the docroot means no file ever appears. The write is suppressed so a bad write can never take the app down, but on failure the reason and the line fall to </w:t>
       </w:r>
       <w:r>
         <w:t xml:space="preserve">error_log</w:t>
       </w:r>
       <w:r>
-        <w:t xml:space="preserve"> (the instance php.log) instead of vanishing. The monthly LCCOnline_logs purge keys on modification time, so an actively appended log is never swept; archive it if you want multi-year audit history. Replaced the RQSACTLOGT Db2 table, which nothing read.</w:t>
+        <w:t xml:space="preserve"> (the instance php.log) instead of vanishing. The monthly purge of that folder keys on modification time, so a log that is actively appended to is never swept, and it should be archived for multi year audit history.</w:t>
       </w:r>
     </w:p>
     <w:p>
@@ -1634,7 +1582,19 @@
         <w:spacing w:after="80"/>
       </w:pPr>
       <w:r>
-        <w:t xml:space="preserve">RUNSQLSTM the three .TABLE members (RQSREQHDRT, RQSREQDTLT, RQSCODEFLT), then the nine .PROC members. Members are re-runnable (CREATE OR REPLACE); never hardcode the library in source - it breaks promotion.</w:t>
+        <w:t xml:space="preserve">RUNSQLSTM the three </w:t>
+      </w:r>
+      <w:r>
+        <w:t xml:space="preserve">.TABLE</w:t>
+      </w:r>
+      <w:r>
+        <w:t xml:space="preserve"> members (RQSREQHDRT, RQSREQDTLT, RQSCODEFLT), then the nine </w:t>
+      </w:r>
+      <w:r>
+        <w:t xml:space="preserve">.PROC</w:t>
+      </w:r>
+      <w:r>
+        <w:t xml:space="preserve"> members. Members are re runnable, and the library must never be hardcoded in source because that breaks promotion.</w:t>
       </w:r>
     </w:p>
     <w:p>
@@ -1647,7 +1607,7 @@
         <w:spacing w:after="80"/>
       </w:pPr>
       <w:r>
-        <w:t xml:space="preserve">STRJRNPF the tables to LSCSAVLIB/LSCJRN IMAGES(*BOTH) OMTJRNE(*OPNCLO).</w:t>
+        <w:t xml:space="preserve">STRJRNPF the tables to LSCSAVLIB/LSCJRN with IMAGES(*BOTH) OMTJRNE(*OPNCLO).</w:t>
       </w:r>
     </w:p>
     <w:p>
@@ -1660,7 +1620,7 @@
         <w:spacing w:after="80"/>
       </w:pPr>
       <w:r>
-        <w:t xml:space="preserve">Load Data/*.csv with CPYFRMIMPF (already in Db2 format - all transforms were done at export time), or the dev-only seed page.</w:t>
+        <w:t xml:space="preserve">Load the history with CPYFRMIMPF. The load files are already in Db2 format because every conversion was done at export time.</w:t>
       </w:r>
     </w:p>
     <w:p>
@@ -1673,7 +1633,13 @@
         <w:spacing w:after="80"/>
       </w:pPr>
       <w:r>
-        <w:t xml:space="preserve">ALTER TABLE RQSREQHDRT ALTER COLUMN RHREQ# RESTART WITH 17179.</w:t>
+        <w:t xml:space="preserve">Run </w:t>
+      </w:r>
+      <w:r>
+        <w:t xml:space="preserve">ALTER TABLE RQSREQHDRT ALTER COLUMN RHREQ# RESTART WITH 17179</w:t>
+      </w:r>
+      <w:r>
+        <w:t xml:space="preserve">.</w:t>
       </w:r>
     </w:p>
     <w:p>
@@ -1686,7 +1652,7 @@
         <w:spacing w:after="80"/>
       </w:pPr>
       <w:r>
-        <w:t xml:space="preserve">Validate: 14,073 headers / 50,063 lines / 741 open / SUM(qty) 33,464,119 / 90 code rows.</w:t>
+        <w:t xml:space="preserve">Validate the load: 14,073 headers, 50,063 lines, 741 open lines, SUM(qty) of 33,464,119, and 90 code rows.</w:t>
       </w:r>
     </w:p>
     <w:p>
@@ -1699,7 +1665,7 @@
         <w:spacing w:after="80"/>
       </w:pPr>
       <w:r>
-        <w:t xml:space="preserve">Copy the four Web/ files to the LCCOnline docroot. Web profile needs authority to the library (SQL0551 means GRTOBJAUT) and write authority for the activity log.</w:t>
+        <w:t xml:space="preserve">Copy the four PHP files to the LCCOnline docroot. The web profile needs authority to the library, where SQL0551 means a GRTOBJAUT is missing, plus write authority for the activity log folder.</w:t>
       </w:r>
     </w:p>
     <w:p>
@@ -1712,7 +1678,19 @@
         <w:spacing w:after="80"/>
       </w:pPr>
       <w:r>
-        <w:t xml:space="preserve">RFP mirrors Sellbrite 3185: 12 Db2 objects as *SQLTAB from LSCDEVLIBP + 4 *IFS/PHPSRC files, level 10.</w:t>
+        <w:t xml:space="preserve">Assign the RFP objects: 12 Db2 objects as </w:t>
+      </w:r>
+      <w:r>
+        <w:t xml:space="preserve">*SQLTAB</w:t>
+      </w:r>
+      <w:r>
+        <w:t xml:space="preserve"> from LSCDEVLIBP plus the 4 PHP files as </w:t>
+      </w:r>
+      <w:r>
+        <w:t xml:space="preserve">*IFS</w:t>
+      </w:r>
+      <w:r>
+        <w:t xml:space="preserve"> at level 10.</w:t>
       </w:r>
     </w:p>
     <w:p>
@@ -1720,7 +1698,7 @@
         <w:pStyle w:val="Heading1"/>
       </w:pPr>
       <w:r>
-        <w:t xml:space="preserve">9. Deliberate changes vs legacy</w:t>
+        <w:t xml:space="preserve">9. Deliberate changes from the old system</w:t>
       </w:r>
     </w:p>
     <w:p>
@@ -1733,7 +1711,7 @@
         <w:spacing w:after="80"/>
       </w:pPr>
       <w:r>
-        <w:t xml:space="preserve">Identity column replaces max(req_num)+1 (duplicate-req race fixed).</w:t>
+        <w:t xml:space="preserve">An identity column replaces the old max plus one numbering, which fixes the duplicate requisition race.</w:t>
       </w:r>
     </w:p>
     <w:p>
@@ -1746,7 +1724,7 @@
         <w:spacing w:after="80"/>
       </w:pPr>
       <w:r>
-        <w:t xml:space="preserve">Bound-parameter procs replace string-built SQL (injection fixed).</w:t>
+        <w:t xml:space="preserve">Bound parameter procedures replace SQL built by string concatenation, which closes the injection hole.</w:t>
       </w:r>
     </w:p>
     <w:p>
@@ -1759,7 +1737,13 @@
         <w:spacing w:after="80"/>
       </w:pPr>
       <w:r>
-        <w:t xml:space="preserve">Session sign-on + chkAutUsr replace HTTP Basic auth; the Firefox-only user-agent check is gone.</w:t>
+        <w:t xml:space="preserve">Session sign on with </w:t>
+      </w:r>
+      <w:r>
+        <w:t xml:space="preserve">chkAutUsr</w:t>
+      </w:r>
+      <w:r>
+        <w:t xml:space="preserve"> replaces basic authentication, and the Firefox only browser check is gone.</w:t>
       </w:r>
     </w:p>
     <w:p>
@@ -1772,7 +1756,7 @@
         <w:spacing w:after="80"/>
       </w:pPr>
       <w:r>
-        <w:t xml:space="preserve">The add form grows lines dynamically instead of 30 fixed rows.</w:t>
+        <w:t xml:space="preserve">The entry form grows lines as needed instead of showing 30 fixed rows.</w:t>
       </w:r>
     </w:p>
     <w:p>
@@ -1785,7 +1769,7 @@
         <w:spacing w:after="80"/>
       </w:pPr>
       <w:r>
-        <w:t xml:space="preserve">Badge no longer derived from the requestor name (substr): new requisitions store 0 and are filled in later; editable inline with an employee dropdown that commits only a number.</w:t>
+        <w:t xml:space="preserve">The badge is stored properly at 10 characters and can be edited from the grid.</w:t>
       </w:r>
     </w:p>
     <w:p>
@@ -1798,7 +1782,7 @@
         <w:spacing w:after="80"/>
       </w:pPr>
       <w:r>
-        <w:t xml:space="preserve">Returns from the grid require a date (autofilled today, editable) and commit on refresh; the view window still stamps today directly.</w:t>
+        <w:t xml:space="preserve">Returns from the grid require a date, autofilled to today and editable, and commit on refresh, while the view window still stamps today directly.</w:t>
       </w:r>
     </w:p>
     <w:p>
@@ -1811,7 +1795,7 @@
         <w:spacing w:after="80"/>
       </w:pPr>
       <w:r>
-        <w:t xml:space="preserve">A failed submit backs out completely instead of half-saving.</w:t>
+        <w:t xml:space="preserve">A failed submit backs out completely instead of half saving.</w:t>
       </w:r>
     </w:p>
     <w:p>
@@ -1824,20 +1808,7 @@
         <w:spacing w:after="80"/>
       </w:pPr>
       <w:r>
-        <w:t xml:space="preserve">The Authorized pill shows green for any real authorizer name (the None / In Process placeholders stay yellow), no longer gated on the inconsistent legacy authorized flag.</w:t>
-      </w:r>
-    </w:p>
-    <w:p>
-      <w:pPr>
-        <w:pStyle w:val="ListParagraph"/>
-        <w:numPr>
-          <w:ilvl w:val="0"/>
-          <w:numId w:val="4"/>
-        </w:numPr>
-        <w:spacing w:after="80"/>
-      </w:pPr>
-      <w:r>
-        <w:t xml:space="preserve">A grid Show filter (Open / Returned / All) can bring returned req forms back up with their return dates - Access only ever showed open lines.</w:t>
+        <w:t xml:space="preserve">The Show filter can bring returned req forms back up with their return dates, which the old screen could never do.</w:t>
       </w:r>
     </w:p>
     <w:p>
@@ -1861,7 +1832,10 @@
         <w:rPr>
           <w:shd w:fill="FFF35C" w:val="clear"/>
         </w:rPr>
-        <w:t xml:space="preserve">The raw .mdb files never go in git: they carry plaintext credentials (both flagged for rotation at cutover).</w:t>
+        <w:t xml:space="preserve">The two passwords found in the old system are flagged for rotation at cutover.</w:t>
+      </w:r>
+      <w:r>
+        <w:t xml:space="preserve"> They were stored in plain text where anyone with the file could read them.</w:t>
       </w:r>
     </w:p>
     <w:p>
@@ -1874,7 +1848,7 @@
         <w:spacing w:after="80"/>
       </w:pPr>
       <w:r>
-        <w:t xml:space="preserve">The legacy PHP and the full Access extraction (VBA, queries, schemas, data) are preserved in the migration branch’s git history.</w:t>
+        <w:t xml:space="preserve">The station grid opens on open lines only, but the Show filter surfaces returned lines too. Nothing is deleted, and REQSTN009S runs only as the insert back out.</w:t>
       </w:r>
     </w:p>
     <w:p>
@@ -1887,20 +1861,7 @@
         <w:spacing w:after="80"/>
       </w:pPr>
       <w:r>
-        <w:t xml:space="preserve">The station grid opens on open lines only, but the Show filter surfaces returned lines too; nothing is deleted - REQSTN009S runs only as the insert back-out.</w:t>
-      </w:r>
-    </w:p>
-    <w:p>
-      <w:pPr>
-        <w:pStyle w:val="ListParagraph"/>
-        <w:numPr>
-          <w:ilvl w:val="0"/>
-          <w:numId w:val="2"/>
-        </w:numPr>
-        <w:spacing w:after="80"/>
-      </w:pPr>
-      <w:r>
-        <w:t xml:space="preserve">Blank page after a copy usually means a stale or corrupted file - compare against git and Ctrl+F5.</w:t>
+        <w:t xml:space="preserve">A blank page after a copy usually means a stale or corrupted file, so recopy it and press Ctrl+F5.</w:t>
       </w:r>
     </w:p>
     <w:sectPr>

</xml_diff>

<commit_message>
Restructure both guides to match the house documentation style
Read the existing notebook pages and followed the same shape.

User Guide: the entry form is now a numbered walkthrough, Step 1 through
Step 4, with the fields listed under the step they belong to. Every
bullet leads with the control it describes, so a reader scanning for
Filter or Badge finds it without reading the sentence. Added the note
about an item missing from the list and the green return date.

Technical Reference: added a Things not to do section carrying the five
mistakes that cost real time, each stating the consequence rather than
just the rule, and moved the softer notes to Good to know.

Co-Authored-By: Claude Fable 5 <noreply@anthropic.com>
Claude-Session: https://claude.ai/code/session_01SfunpdkVdapnCdtb2hWS9U
</commit_message>
<xml_diff>
--- a/RequestMaterial/docs/Requisition Material - Technical Reference.docx
+++ b/RequestMaterial/docs/Requisition Material - Technical Reference.docx
@@ -1816,7 +1816,121 @@
         <w:pStyle w:val="Heading1"/>
       </w:pPr>
       <w:r>
-        <w:t xml:space="preserve">10. Good to know</w:t>
+        <w:t xml:space="preserve">10. Things not to do</w:t>
+      </w:r>
+    </w:p>
+    <w:p>
+      <w:pPr>
+        <w:pStyle w:val="ListParagraph"/>
+        <w:numPr>
+          <w:ilvl w:val="0"/>
+          <w:numId w:val="2"/>
+        </w:numPr>
+        <w:spacing w:after="80"/>
+      </w:pPr>
+      <w:r>
+        <w:rPr>
+          <w:b/>
+          <w:bCs/>
+        </w:rPr>
+        <w:t xml:space="preserve">Never add a parameter to a procedure without dropping the old signature.</w:t>
+      </w:r>
+      <w:r>
+        <w:t xml:space="preserve"> </w:t>
+      </w:r>
+      <w:r>
+        <w:t xml:space="preserve">CREATE OR REPLACE</w:t>
+      </w:r>
+      <w:r>
+        <w:t xml:space="preserve"> leaves the previous overload in place and the web profile may keep resolving to it, so the change appears to do nothing.</w:t>
+      </w:r>
+    </w:p>
+    <w:p>
+      <w:pPr>
+        <w:pStyle w:val="ListParagraph"/>
+        <w:numPr>
+          <w:ilvl w:val="0"/>
+          <w:numId w:val="2"/>
+        </w:numPr>
+        <w:spacing w:after="80"/>
+      </w:pPr>
+      <w:r>
+        <w:rPr>
+          <w:b/>
+          <w:bCs/>
+        </w:rPr>
+        <w:t xml:space="preserve">Never hardcode the library in source.</w:t>
+      </w:r>
+      <w:r>
+        <w:t xml:space="preserve"> The members are promoted between libraries, and a hardcoded name breaks that.</w:t>
+      </w:r>
+    </w:p>
+    <w:p>
+      <w:pPr>
+        <w:pStyle w:val="ListParagraph"/>
+        <w:numPr>
+          <w:ilvl w:val="0"/>
+          <w:numId w:val="2"/>
+        </w:numPr>
+        <w:spacing w:after="80"/>
+      </w:pPr>
+      <w:r>
+        <w:rPr>
+          <w:b/>
+          <w:bCs/>
+        </w:rPr>
+        <w:t xml:space="preserve">Never point the activity log at the docroot.</w:t>
+      </w:r>
+      <w:r>
+        <w:t xml:space="preserve"> The web profile cannot write there, and because the write is suppressed the file simply never appears.</w:t>
+      </w:r>
+    </w:p>
+    <w:p>
+      <w:pPr>
+        <w:pStyle w:val="ListParagraph"/>
+        <w:numPr>
+          <w:ilvl w:val="0"/>
+          <w:numId w:val="2"/>
+        </w:numPr>
+        <w:spacing w:after="80"/>
+      </w:pPr>
+      <w:r>
+        <w:rPr>
+          <w:b/>
+          <w:bCs/>
+        </w:rPr>
+        <w:t xml:space="preserve">Never lift the 500 row cap on Returned and All.</w:t>
+      </w:r>
+      <w:r>
+        <w:t xml:space="preserve"> Roughly 49,000 of the 50,000 detail lines are returned, and drawing them all locks up the browser. Use the Filter search to reach older ones instead.</w:t>
+      </w:r>
+    </w:p>
+    <w:p>
+      <w:pPr>
+        <w:pStyle w:val="ListParagraph"/>
+        <w:numPr>
+          <w:ilvl w:val="0"/>
+          <w:numId w:val="2"/>
+        </w:numPr>
+        <w:spacing w:after="80"/>
+      </w:pPr>
+      <w:r>
+        <w:rPr>
+          <w:b/>
+          <w:bCs/>
+        </w:rPr>
+        <w:t xml:space="preserve">Never use REQSTN009S as a user facing delete.</w:t>
+      </w:r>
+      <w:r>
+        <w:t xml:space="preserve"> It exists only to back out a half written insert. The old system had no delete either, and returning a line is what takes it off the grid.</w:t>
+      </w:r>
+    </w:p>
+    <w:p>
+      <w:pPr>
+        <w:pStyle w:val="Heading1"/>
+      </w:pPr>
+      <w:r>
+        <w:t xml:space="preserve">11. Good to know</w:t>
       </w:r>
     </w:p>
     <w:p>
@@ -1848,7 +1962,7 @@
         <w:spacing w:after="80"/>
       </w:pPr>
       <w:r>
-        <w:t xml:space="preserve">The station grid opens on open lines only, but the Show filter surfaces returned lines too. Nothing is deleted, and REQSTN009S runs only as the insert back out.</w:t>
+        <w:t xml:space="preserve">The station grid opens on open lines only, but the Show filter surfaces returned lines too. Nothing is ever deleted.</w:t>
       </w:r>
     </w:p>
     <w:p>
@@ -1862,6 +1976,19 @@
       </w:pPr>
       <w:r>
         <w:t xml:space="preserve">A blank page after a copy usually means a stale or corrupted file, so recopy it and press Ctrl+F5.</w:t>
+      </w:r>
+    </w:p>
+    <w:p>
+      <w:pPr>
+        <w:pStyle w:val="ListParagraph"/>
+        <w:numPr>
+          <w:ilvl w:val="0"/>
+          <w:numId w:val="2"/>
+        </w:numPr>
+        <w:spacing w:after="80"/>
+      </w:pPr>
+      <w:r>
+        <w:t xml:space="preserve">SQL0551 on a procedure call means the web profile is missing authority to the library, which is a GRTOBJAUT, not a code problem.</w:t>
       </w:r>
     </w:p>
     <w:sectPr>

</xml_diff>

<commit_message>
Tidy the replaced pages and document the redirect
Comments in the three replaced pages are single lines again with none
sitting back to back, matching the rest of the project.

Trimmed request.php now that the redirect is confirmed working in dev.
The script that duplicated the meta refresh is gone, as is a parameter
the original page never used. The header, the meta refresh and the plain
link remain, which is the header plus one fallback for the case where
something printed first.

Removed the probe, which has served its purpose.

Both guides now describe the old address forwarding onto the new screen,
including the note for users that their existing bookmark still works.

Co-Authored-By: Claude Fable 5 <noreply@anthropic.com>
Claude-Session: https://claude.ai/code/session_01SfunpdkVdapnCdtb2hWS9U
</commit_message>
<xml_diff>
--- a/RequestMaterial/docs/Requisition Material - Technical Reference.docx
+++ b/RequestMaterial/docs/Requisition Material - Technical Reference.docx
@@ -73,7 +73,7 @@
         <w:pStyle w:val="Heading2"/>
       </w:pPr>
       <w:r>
-        <w:t xml:space="preserve">The four PHP files</w:t>
+        <w:t xml:space="preserve">The PHP files</w:t>
       </w:r>
     </w:p>
     <w:tbl>
@@ -313,11 +313,208 @@
           </w:p>
         </w:tc>
       </w:tr>
+      <w:tr>
+        <w:tc>
+          <w:tcPr>
+            <w:tcW w:type="dxa" w:w="3100"/>
+            <w:tcMar>
+              <w:top w:type="dxa" w:w="60"/>
+              <w:left w:type="dxa" w:w="100"/>
+              <w:bottom w:type="dxa" w:w="60"/>
+              <w:right w:type="dxa" w:w="100"/>
+            </w:tcMar>
+          </w:tcPr>
+          <w:p>
+            <w:pPr>
+              <w:spacing w:after="0"/>
+            </w:pPr>
+            <w:r>
+              <w:t xml:space="preserve">request.php</w:t>
+            </w:r>
+          </w:p>
+        </w:tc>
+        <w:tc>
+          <w:tcPr>
+            <w:tcW w:type="dxa" w:w="6260"/>
+            <w:tcMar>
+              <w:top w:type="dxa" w:w="60"/>
+              <w:left w:type="dxa" w:w="100"/>
+              <w:bottom w:type="dxa" w:w="60"/>
+              <w:right w:type="dxa" w:w="100"/>
+            </w:tcMar>
+          </w:tcPr>
+          <w:p>
+            <w:pPr>
+              <w:spacing w:after="0"/>
+            </w:pPr>
+            <w:r>
+              <w:t xml:space="preserve">The old requisition address, now a redirect onto the new screen.</w:t>
+            </w:r>
+          </w:p>
+        </w:tc>
+      </w:tr>
+      <w:tr>
+        <w:tc>
+          <w:tcPr>
+            <w:tcW w:type="dxa" w:w="3100"/>
+            <w:tcMar>
+              <w:top w:type="dxa" w:w="60"/>
+              <w:left w:type="dxa" w:w="100"/>
+              <w:bottom w:type="dxa" w:w="60"/>
+              <w:right w:type="dxa" w:w="100"/>
+            </w:tcMar>
+          </w:tcPr>
+          <w:p>
+            <w:pPr>
+              <w:spacing w:after="0"/>
+            </w:pPr>
+            <w:r>
+              <w:t xml:space="preserve">getInsert.php</w:t>
+            </w:r>
+          </w:p>
+        </w:tc>
+        <w:tc>
+          <w:tcPr>
+            <w:tcW w:type="dxa" w:w="6260"/>
+            <w:tcMar>
+              <w:top w:type="dxa" w:w="60"/>
+              <w:left w:type="dxa" w:w="100"/>
+              <w:bottom w:type="dxa" w:w="60"/>
+              <w:right w:type="dxa" w:w="100"/>
+            </w:tcMar>
+          </w:tcPr>
+          <w:p>
+            <w:pPr>
+              <w:spacing w:after="0"/>
+            </w:pPr>
+            <w:r>
+              <w:t xml:space="preserve">The old save target, now refuses the write and says nothing was saved.</w:t>
+            </w:r>
+          </w:p>
+        </w:tc>
+      </w:tr>
+      <w:tr>
+        <w:tc>
+          <w:tcPr>
+            <w:tcW w:type="dxa" w:w="3100"/>
+            <w:tcMar>
+              <w:top w:type="dxa" w:w="60"/>
+              <w:left w:type="dxa" w:w="100"/>
+              <w:bottom w:type="dxa" w:w="60"/>
+              <w:right w:type="dxa" w:w="100"/>
+            </w:tcMar>
+          </w:tcPr>
+          <w:p>
+            <w:pPr>
+              <w:spacing w:after="0"/>
+            </w:pPr>
+            <w:r>
+              <w:t xml:space="preserve">getUpdate.php</w:t>
+            </w:r>
+          </w:p>
+        </w:tc>
+        <w:tc>
+          <w:tcPr>
+            <w:tcW w:type="dxa" w:w="6260"/>
+            <w:tcMar>
+              <w:top w:type="dxa" w:w="60"/>
+              <w:left w:type="dxa" w:w="100"/>
+              <w:bottom w:type="dxa" w:w="60"/>
+              <w:right w:type="dxa" w:w="100"/>
+            </w:tcMar>
+          </w:tcPr>
+          <w:p>
+            <w:pPr>
+              <w:spacing w:after="0"/>
+            </w:pPr>
+            <w:r>
+              <w:t xml:space="preserve">The old authorize save, same treatment.</w:t>
+            </w:r>
+          </w:p>
+        </w:tc>
+      </w:tr>
     </w:tbl>
     <w:p>
       <w:pPr>
         <w:spacing w:after="120"/>
       </w:pPr>
+    </w:p>
+    <w:p>
+      <w:pPr>
+        <w:pStyle w:val="Heading2"/>
+      </w:pPr>
+      <w:r>
+        <w:t xml:space="preserve">Keeping the old address alive</w:t>
+      </w:r>
+    </w:p>
+    <w:p>
+      <w:pPr>
+        <w:spacing w:after="120"/>
+      </w:pPr>
+      <w:r>
+        <w:t xml:space="preserve">request.php</w:t>
+      </w:r>
+      <w:r>
+        <w:t xml:space="preserve"> keeps its original address so every bookmark, desktop shortcut and station link still works. With no parameters it sends the user to the entry form; with a requisition number it opens that requisition. The redirect is the first thing the file does, so the old browser check and the old password prompt never run.</w:t>
+      </w:r>
+    </w:p>
+    <w:p>
+      <w:pPr>
+        <w:spacing w:after="120"/>
+      </w:pPr>
+      <w:r>
+        <w:t xml:space="preserve">It sends a temporary redirect rather than a permanent one on purpose: a browser caches a permanent redirect indefinitely, which would keep sending users to the new screen even after a rollback put the old file back. </w:t>
+      </w:r>
+      <w:r>
+        <w:t xml:space="preserve">RQS_NEW_APP</w:t>
+      </w:r>
+      <w:r>
+        <w:t xml:space="preserve"> at the top of the file holds the target address and is the only line to change if the screen moves. Adding </w:t>
+      </w:r>
+      <w:r>
+        <w:t xml:space="preserve">shimtest</w:t>
+      </w:r>
+      <w:r>
+        <w:t xml:space="preserve"> to the old address prints the target instead of redirecting, which is how the address is checked before anyone is pointed at it.</w:t>
+      </w:r>
+    </w:p>
+    <w:p>
+      <w:pPr>
+        <w:spacing w:after="120"/>
+      </w:pPr>
+      <w:r>
+        <w:t xml:space="preserve">getInsert.php</w:t>
+      </w:r>
+      <w:r>
+        <w:t xml:space="preserve"> and </w:t>
+      </w:r>
+      <w:r>
+        <w:t xml:space="preserve">getUpdate.php</w:t>
+      </w:r>
+      <w:r>
+        <w:t xml:space="preserve"> are the POST targets of the old form and the old view page, reachable only by submitting them, so a browser tab left open on the old form could still write into the old database after cutover. Both now refuse the write and say plainly that nothing was saved. </w:t>
+      </w:r>
+      <w:r>
+        <w:rPr>
+          <w:shd w:fill="FFF35C" w:val="clear"/>
+        </w:rPr>
+        <w:t xml:space="preserve">They deliberately do not redirect silently</w:t>
+      </w:r>
+      <w:r>
+        <w:t xml:space="preserve">, which would let someone believe their entry was filed. </w:t>
+      </w:r>
+      <w:r>
+        <w:t xml:space="preserve">getEntry.php</w:t>
+      </w:r>
+      <w:r>
+        <w:t xml:space="preserve"> and </w:t>
+      </w:r>
+      <w:r>
+        <w:t xml:space="preserve">getIdInfo.php</w:t>
+      </w:r>
+      <w:r>
+        <w:t xml:space="preserve"> hold only function definitions and print nothing when opened directly, so they need no replacement.</w:t>
+      </w:r>
     </w:p>
     <w:p>
       <w:pPr>

</xml_diff>

<commit_message>
Trim the project to what ships
Removed the two old save pages. The old folder retires at cutover
anyway, so once it is gone nothing can reach them and a replacement page
is not worth carrying.

Removed the checklist. The parts still worth keeping now live in the
Technical Reference: the procedure drops needed in a library built
during development are written out in full there, next to the note that
explains why they are needed.

Removed the presentation and overview documents. The User Guide and the
Technical Reference are the two that get used.

Co-Authored-By: Claude Fable 5 <noreply@anthropic.com>
Claude-Session: https://claude.ai/code/session_01SfunpdkVdapnCdtb2hWS9U
</commit_message>
<xml_diff>
--- a/RequestMaterial/docs/Requisition Material - Technical Reference.docx
+++ b/RequestMaterial/docs/Requisition Material - Technical Reference.docx
@@ -353,86 +353,6 @@
           </w:p>
         </w:tc>
       </w:tr>
-      <w:tr>
-        <w:tc>
-          <w:tcPr>
-            <w:tcW w:type="dxa" w:w="3100"/>
-            <w:tcMar>
-              <w:top w:type="dxa" w:w="60"/>
-              <w:left w:type="dxa" w:w="100"/>
-              <w:bottom w:type="dxa" w:w="60"/>
-              <w:right w:type="dxa" w:w="100"/>
-            </w:tcMar>
-          </w:tcPr>
-          <w:p>
-            <w:pPr>
-              <w:spacing w:after="0"/>
-            </w:pPr>
-            <w:r>
-              <w:t xml:space="preserve">getInsert.php</w:t>
-            </w:r>
-          </w:p>
-        </w:tc>
-        <w:tc>
-          <w:tcPr>
-            <w:tcW w:type="dxa" w:w="6260"/>
-            <w:tcMar>
-              <w:top w:type="dxa" w:w="60"/>
-              <w:left w:type="dxa" w:w="100"/>
-              <w:bottom w:type="dxa" w:w="60"/>
-              <w:right w:type="dxa" w:w="100"/>
-            </w:tcMar>
-          </w:tcPr>
-          <w:p>
-            <w:pPr>
-              <w:spacing w:after="0"/>
-            </w:pPr>
-            <w:r>
-              <w:t xml:space="preserve">The old save target, now refuses the write and says nothing was saved.</w:t>
-            </w:r>
-          </w:p>
-        </w:tc>
-      </w:tr>
-      <w:tr>
-        <w:tc>
-          <w:tcPr>
-            <w:tcW w:type="dxa" w:w="3100"/>
-            <w:tcMar>
-              <w:top w:type="dxa" w:w="60"/>
-              <w:left w:type="dxa" w:w="100"/>
-              <w:bottom w:type="dxa" w:w="60"/>
-              <w:right w:type="dxa" w:w="100"/>
-            </w:tcMar>
-          </w:tcPr>
-          <w:p>
-            <w:pPr>
-              <w:spacing w:after="0"/>
-            </w:pPr>
-            <w:r>
-              <w:t xml:space="preserve">getUpdate.php</w:t>
-            </w:r>
-          </w:p>
-        </w:tc>
-        <w:tc>
-          <w:tcPr>
-            <w:tcW w:type="dxa" w:w="6260"/>
-            <w:tcMar>
-              <w:top w:type="dxa" w:w="60"/>
-              <w:left w:type="dxa" w:w="100"/>
-              <w:bottom w:type="dxa" w:w="60"/>
-              <w:right w:type="dxa" w:w="100"/>
-            </w:tcMar>
-          </w:tcPr>
-          <w:p>
-            <w:pPr>
-              <w:spacing w:after="0"/>
-            </w:pPr>
-            <w:r>
-              <w:t xml:space="preserve">The old authorize save, same treatment.</w:t>
-            </w:r>
-          </w:p>
-        </w:tc>
-      </w:tr>
     </w:tbl>
     <w:p>
       <w:pPr>
@@ -483,37 +403,28 @@
         <w:spacing w:after="120"/>
       </w:pPr>
       <w:r>
-        <w:t xml:space="preserve">getInsert.php</w:t>
+        <w:t xml:space="preserve">The rest of the old folder retires at cutover. </w:t>
+      </w:r>
+      <w:r>
+        <w:t xml:space="preserve">getEntry.php</w:t>
       </w:r>
       <w:r>
         <w:t xml:space="preserve"> and </w:t>
       </w:r>
       <w:r>
-        <w:t xml:space="preserve">getUpdate.php</w:t>
-      </w:r>
-      <w:r>
-        <w:t xml:space="preserve"> are the POST targets of the old form and the old view page, reachable only by submitting them, so a browser tab left open on the old form could still write into the old database after cutover. Both now refuse the write and say plainly that nothing was saved. </w:t>
+        <w:t xml:space="preserve">getIdInfo.php</w:t>
+      </w:r>
+      <w:r>
+        <w:t xml:space="preserve"> hold only function definitions and print nothing on their own, and the old save pages go with them, so </w:t>
       </w:r>
       <w:r>
         <w:rPr>
           <w:shd w:fill="FFF35C" w:val="clear"/>
         </w:rPr>
-        <w:t xml:space="preserve">They deliberately do not redirect silently</w:t>
-      </w:r>
-      <w:r>
-        <w:t xml:space="preserve">, which would let someone believe their entry was filed. </w:t>
-      </w:r>
-      <w:r>
-        <w:t xml:space="preserve">getEntry.php</w:t>
-      </w:r>
-      <w:r>
-        <w:t xml:space="preserve"> and </w:t>
-      </w:r>
-      <w:r>
-        <w:t xml:space="preserve">getIdInfo.php</w:t>
-      </w:r>
-      <w:r>
-        <w:t xml:space="preserve"> hold only function definitions and print nothing when opened directly, so they need no replacement.</w:t>
+        <w:t xml:space="preserve">once the folder is gone nothing can write to the old database</w:t>
+      </w:r>
+      <w:r>
+        <w:t xml:space="preserve">.</w:t>
       </w:r>
     </w:p>
     <w:p>
@@ -1432,7 +1343,31 @@
         <w:t xml:space="preserve">DROP PROCEDURE name(type, type)</w:t>
       </w:r>
       <w:r>
-        <w:t xml:space="preserve">. The RFP checklist tracks the drops done during development.</w:t>
+        <w:t xml:space="preserve">. Three procedures changed signature during development, so a library that was built along the way needs these dropped once: </w:t>
+      </w:r>
+      <w:r>
+        <w:t xml:space="preserve">DROP PROCEDURE REQSTN003S()</w:t>
+      </w:r>
+      <w:r>
+        <w:t xml:space="preserve">, </w:t>
+      </w:r>
+      <w:r>
+        <w:t xml:space="preserve">DROP PROCEDURE REQSTN003S(CHAR)</w:t>
+      </w:r>
+      <w:r>
+        <w:t xml:space="preserve">, </w:t>
+      </w:r>
+      <w:r>
+        <w:t xml:space="preserve">DROP PROCEDURE REQSTN005S(DECIMAL, VARCHAR, VARCHAR)</w:t>
+      </w:r>
+      <w:r>
+        <w:t xml:space="preserve"> and </w:t>
+      </w:r>
+      <w:r>
+        <w:t xml:space="preserve">DROP PROCEDURE REQSTN006S(DECIMAL, DECIMAL, CHAR)</w:t>
+      </w:r>
+      <w:r>
+        <w:t xml:space="preserve">.</w:t>
       </w:r>
     </w:p>
     <w:p>

</xml_diff>

<commit_message>
Remove the markdown files, leaving the two Word documents
Folded the parts that lived only in markdown into the Technical
Reference first, so nothing operational was lost: the load now spells out
the CCSID tagging and the CPYFRMIMPF command, and the validation step
carries the full set of expected totals rather than a subset.

The seed page no longer points at a file that is gone.

Co-Authored-By: Claude Fable 5 <noreply@anthropic.com>
Claude-Session: https://claude.ai/code/session_01SfunpdkVdapnCdtb2hWS9U
</commit_message>
<xml_diff>
--- a/RequestMaterial/docs/Requisition Material - Technical Reference.docx
+++ b/RequestMaterial/docs/Requisition Material - Technical Reference.docx
@@ -1752,7 +1752,19 @@
         <w:spacing w:after="80"/>
       </w:pPr>
       <w:r>
-        <w:t xml:space="preserve">Load the history with CPYFRMIMPF. The load files are already in Db2 format because every conversion was done at export time.</w:t>
+        <w:t xml:space="preserve">Copy the load files to the IFS and tag them UTF-8 with </w:t>
+      </w:r>
+      <w:r>
+        <w:t xml:space="preserve">CHGATR OBJ(...) ATR(*CCSID) VALUE(1208)</w:t>
+      </w:r>
+      <w:r>
+        <w:t xml:space="preserve">, then load each one with </w:t>
+      </w:r>
+      <w:r>
+        <w:t xml:space="preserve">CPYFRMIMPF FROMSTMF(...) TOFILE(lib/table) MBROPT(*REPLACE) RCDDLM(*ALL) FLDDLM(comma) STRDLM(quote)</w:t>
+      </w:r>
+      <w:r>
+        <w:t xml:space="preserve">, headers before details. The files are already in Db2 format because every conversion was done at export time, so no staging table is needed.</w:t>
       </w:r>
     </w:p>
     <w:p>
@@ -1784,7 +1796,7 @@
         <w:spacing w:after="80"/>
       </w:pPr>
       <w:r>
-        <w:t xml:space="preserve">Validate the load: 14,073 headers, 50,063 lines, 741 open lines, SUM(qty) of 33,464,119, and 90 code rows.</w:t>
+        <w:t xml:space="preserve">Validate the load, which must reproduce these exactly: 14,073 headers, 50,063 lines, 741 open lines, SUM(qty) of 33,464,119, 90 code rows, 46 authorized, 2,349 rush, and a MAX req number of 17,178.</w:t>
       </w:r>
     </w:p>
     <w:p>

</xml_diff>